<commit_message>
feat(orientacion): contacto (estudiante+acudientes) en remision (vista+Word) y aviso al docente al recibir (#24)
Co-Authored-By: Claude Opus 4.8 <noreply@anthropic.com>
</commit_message>
<xml_diff>
--- a/public/remision_orientacion_template.docx
+++ b/public/remision_orientacion_template.docx
@@ -119,6 +119,28 @@
       </w:tr>
     </w:tbl>
     <w:p/>
+    <w:p>
+      <w:r>
+        <w:rPr>
+          <w:b/>
+        </w:rPr>
+        <w:t xml:space="preserve">TELÉFONO DEL ESTUDIANTE: </w:t>
+      </w:r>
+      <w:r>
+        <w:t>{TELEFONO_ESTUDIANTE}</w:t>
+      </w:r>
+    </w:p>
+    <w:p>
+      <w:r>
+        <w:rPr>
+          <w:b/>
+        </w:rPr>
+        <w:t xml:space="preserve">ACUDIENTES: </w:t>
+      </w:r>
+      <w:r>
+        <w:t>{ACUDIENTES}</w:t>
+      </w:r>
+    </w:p>
     <w:p>
       <w:r>
         <w:rPr>

</xml_diff>